<commit_message>
V1.0 — app scompattata + nuova interfaccia (restyle)
</commit_message>
<xml_diff>
--- a/Supporto DVR Stone/02_Supporto/02_Template/1_Anagrafica azienda.docx
+++ b/Supporto DVR Stone/02_Supporto/02_Template/1_Anagrafica azienda.docx
@@ -1,6 +1,6 @@
 
 <file path=word/document.xml><?xml version="1.0" encoding="utf-8"?>
-<w:document xmlns:wpc="http://schemas.microsoft.com/office/word/2010/wordprocessingCanvas" xmlns:cx="http://schemas.microsoft.com/office/drawing/2014/chartex" xmlns:cx1="http://schemas.microsoft.com/office/drawing/2015/9/8/chartex" xmlns:cx2="http://schemas.microsoft.com/office/drawing/2015/10/21/chartex" xmlns:cx3="http://schemas.microsoft.com/office/drawing/2016/5/9/chartex" xmlns:cx4="http://schemas.microsoft.com/office/drawing/2016/5/10/chartex" xmlns:cx5="http://schemas.microsoft.com/office/drawing/2016/5/11/chartex" xmlns:cx6="http://schemas.microsoft.com/office/drawing/2016/5/12/chartex" xmlns:cx7="http://schemas.microsoft.com/office/drawing/2016/5/13/chartex" xmlns:cx8="http://schemas.microsoft.com/office/drawing/2016/5/14/chartex" xmlns:mc="http://schemas.openxmlformats.org/markup-compatibility/2006" xmlns:aink="http://schemas.microsoft.com/office/drawing/2016/ink" xmlns:am3d="http://schemas.microsoft.com/office/drawing/2017/model3d" xmlns:o="urn:schemas-microsoft-com:office:office" xmlns:oel="http://schemas.microsoft.com/office/2019/extlst" xmlns:r="http://schemas.openxmlformats.org/officeDocument/2006/relationships" xmlns:m="http://schemas.openxmlformats.org/officeDocument/2006/math" xmlns:v="urn:schemas-microsoft-com:vml" xmlns:wp14="http://schemas.microsoft.com/office/word/2010/wordprocessingDrawing" xmlns:wp="http://schemas.openxmlformats.org/drawingml/2006/wordprocessingDrawing" xmlns:w10="urn:schemas-microsoft-com:office:word" xmlns:w="http://schemas.openxmlformats.org/wordprocessingml/2006/main" xmlns:w14="http://schemas.microsoft.com/office/word/2010/wordml" xmlns:w15="http://schemas.microsoft.com/office/word/2012/wordml" xmlns:w16cex="http://schemas.microsoft.com/office/word/2018/wordml/cex" xmlns:w16cid="http://schemas.microsoft.com/office/word/2016/wordml/cid" xmlns:w16="http://schemas.microsoft.com/office/word/2018/wordml" xmlns:w16du="http://schemas.microsoft.com/office/word/2023/wordml/word16du" xmlns:w16sdtdh="http://schemas.microsoft.com/office/word/2020/wordml/sdtdatahash" xmlns:w16se="http://schemas.microsoft.com/office/word/2015/wordml/symex" xmlns:wpg="http://schemas.microsoft.com/office/word/2010/wordprocessingGroup" xmlns:wpi="http://schemas.microsoft.com/office/word/2010/wordprocessingInk" xmlns:wne="http://schemas.microsoft.com/office/word/2006/wordml" xmlns:wps="http://schemas.microsoft.com/office/word/2010/wordprocessingShape" mc:Ignorable="w14 w15 w16se w16cid w16 w16cex w16sdtdh w16du wp14">
+<w:document xmlns:wpc="http://schemas.microsoft.com/office/word/2010/wordprocessingCanvas" xmlns:cx="http://schemas.microsoft.com/office/drawing/2014/chartex" xmlns:cx1="http://schemas.microsoft.com/office/drawing/2015/9/8/chartex" xmlns:cx2="http://schemas.microsoft.com/office/drawing/2015/10/21/chartex" xmlns:cx3="http://schemas.microsoft.com/office/drawing/2016/5/9/chartex" xmlns:cx4="http://schemas.microsoft.com/office/drawing/2016/5/10/chartex" xmlns:cx5="http://schemas.microsoft.com/office/drawing/2016/5/11/chartex" xmlns:cx6="http://schemas.microsoft.com/office/drawing/2016/5/12/chartex" xmlns:cx7="http://schemas.microsoft.com/office/drawing/2016/5/13/chartex" xmlns:cx8="http://schemas.microsoft.com/office/drawing/2016/5/14/chartex" xmlns:mc="http://schemas.openxmlformats.org/markup-compatibility/2006" xmlns:aink="http://schemas.microsoft.com/office/drawing/2016/ink" xmlns:am3d="http://schemas.microsoft.com/office/drawing/2017/model3d" xmlns:o="urn:schemas-microsoft-com:office:office" xmlns:r="http://schemas.openxmlformats.org/officeDocument/2006/relationships" xmlns:m="http://schemas.openxmlformats.org/officeDocument/2006/math" xmlns:v="urn:schemas-microsoft-com:vml" xmlns:wp14="http://schemas.microsoft.com/office/word/2010/wordprocessingDrawing" xmlns:wp="http://schemas.openxmlformats.org/drawingml/2006/wordprocessingDrawing" xmlns:w10="urn:schemas-microsoft-com:office:word" xmlns:w="http://schemas.openxmlformats.org/wordprocessingml/2006/main" xmlns:w14="http://schemas.microsoft.com/office/word/2010/wordml" xmlns:w15="http://schemas.microsoft.com/office/word/2012/wordml" xmlns:w16cex="http://schemas.microsoft.com/office/word/2018/wordml/cex" xmlns:w16cid="http://schemas.microsoft.com/office/word/2016/wordml/cid" xmlns:w16="http://schemas.microsoft.com/office/word/2018/wordml" xmlns:w16sdtdh="http://schemas.microsoft.com/office/word/2020/wordml/sdtdatahash" xmlns:w16se="http://schemas.microsoft.com/office/word/2015/wordml/symex" xmlns:wpg="http://schemas.microsoft.com/office/word/2010/wordprocessingGroup" xmlns:wpi="http://schemas.microsoft.com/office/word/2010/wordprocessingInk" xmlns:wne="http://schemas.microsoft.com/office/word/2006/wordml" xmlns:wps="http://schemas.microsoft.com/office/word/2010/wordprocessingShape" mc:Ignorable="w14 w15 w16se w16cid w16 w16cex w16sdtdh wp14">
   <w:body>
     <w:tbl>
       <w:tblPr>
@@ -23825,7 +23825,7 @@
           </w:tcPr>
           <w:p>
             <w:pPr>
-              <w:jc w:val="right"/>
+              <w:jc w:val="center"/>
               <w:rPr>
                 <w:rFonts w:ascii="Aptos" w:hAnsi="Aptos"/>
                 <w:b/>
@@ -27189,8 +27189,8 @@
         <w:tblLook w:val="04A0" w:firstRow="1" w:lastRow="0" w:firstColumn="1" w:lastColumn="0" w:noHBand="0" w:noVBand="1"/>
       </w:tblPr>
       <w:tblGrid>
-        <w:gridCol w:w="1792"/>
-        <w:gridCol w:w="7836"/>
+        <w:gridCol w:w="1790"/>
+        <w:gridCol w:w="7838"/>
       </w:tblGrid>
       <w:tr>
         <w:trPr>
@@ -29828,7 +29828,7 @@
 </file>
 
 <file path=word/endnotes.xml><?xml version="1.0" encoding="utf-8"?>
-<w:endnotes xmlns:wpc="http://schemas.microsoft.com/office/word/2010/wordprocessingCanvas" xmlns:cx="http://schemas.microsoft.com/office/drawing/2014/chartex" xmlns:cx1="http://schemas.microsoft.com/office/drawing/2015/9/8/chartex" xmlns:cx2="http://schemas.microsoft.com/office/drawing/2015/10/21/chartex" xmlns:cx3="http://schemas.microsoft.com/office/drawing/2016/5/9/chartex" xmlns:cx4="http://schemas.microsoft.com/office/drawing/2016/5/10/chartex" xmlns:cx5="http://schemas.microsoft.com/office/drawing/2016/5/11/chartex" xmlns:cx6="http://schemas.microsoft.com/office/drawing/2016/5/12/chartex" xmlns:cx7="http://schemas.microsoft.com/office/drawing/2016/5/13/chartex" xmlns:cx8="http://schemas.microsoft.com/office/drawing/2016/5/14/chartex" xmlns:mc="http://schemas.openxmlformats.org/markup-compatibility/2006" xmlns:aink="http://schemas.microsoft.com/office/drawing/2016/ink" xmlns:am3d="http://schemas.microsoft.com/office/drawing/2017/model3d" xmlns:o="urn:schemas-microsoft-com:office:office" xmlns:oel="http://schemas.microsoft.com/office/2019/extlst" xmlns:r="http://schemas.openxmlformats.org/officeDocument/2006/relationships" xmlns:m="http://schemas.openxmlformats.org/officeDocument/2006/math" xmlns:v="urn:schemas-microsoft-com:vml" xmlns:wp14="http://schemas.microsoft.com/office/word/2010/wordprocessingDrawing" xmlns:wp="http://schemas.openxmlformats.org/drawingml/2006/wordprocessingDrawing" xmlns:w10="urn:schemas-microsoft-com:office:word" xmlns:w="http://schemas.openxmlformats.org/wordprocessingml/2006/main" xmlns:w14="http://schemas.microsoft.com/office/word/2010/wordml" xmlns:w15="http://schemas.microsoft.com/office/word/2012/wordml" xmlns:w16cex="http://schemas.microsoft.com/office/word/2018/wordml/cex" xmlns:w16cid="http://schemas.microsoft.com/office/word/2016/wordml/cid" xmlns:w16="http://schemas.microsoft.com/office/word/2018/wordml" xmlns:w16du="http://schemas.microsoft.com/office/word/2023/wordml/word16du" xmlns:w16sdtdh="http://schemas.microsoft.com/office/word/2020/wordml/sdtdatahash" xmlns:w16se="http://schemas.microsoft.com/office/word/2015/wordml/symex" xmlns:wpg="http://schemas.microsoft.com/office/word/2010/wordprocessingGroup" xmlns:wpi="http://schemas.microsoft.com/office/word/2010/wordprocessingInk" xmlns:wne="http://schemas.microsoft.com/office/word/2006/wordml" xmlns:wps="http://schemas.microsoft.com/office/word/2010/wordprocessingShape" mc:Ignorable="w14 w15 w16se w16cid w16 w16cex w16sdtdh w16du wp14">
+<w:endnotes xmlns:wpc="http://schemas.microsoft.com/office/word/2010/wordprocessingCanvas" xmlns:cx="http://schemas.microsoft.com/office/drawing/2014/chartex" xmlns:cx1="http://schemas.microsoft.com/office/drawing/2015/9/8/chartex" xmlns:cx2="http://schemas.microsoft.com/office/drawing/2015/10/21/chartex" xmlns:cx3="http://schemas.microsoft.com/office/drawing/2016/5/9/chartex" xmlns:cx4="http://schemas.microsoft.com/office/drawing/2016/5/10/chartex" xmlns:cx5="http://schemas.microsoft.com/office/drawing/2016/5/11/chartex" xmlns:cx6="http://schemas.microsoft.com/office/drawing/2016/5/12/chartex" xmlns:cx7="http://schemas.microsoft.com/office/drawing/2016/5/13/chartex" xmlns:cx8="http://schemas.microsoft.com/office/drawing/2016/5/14/chartex" xmlns:mc="http://schemas.openxmlformats.org/markup-compatibility/2006" xmlns:aink="http://schemas.microsoft.com/office/drawing/2016/ink" xmlns:am3d="http://schemas.microsoft.com/office/drawing/2017/model3d" xmlns:o="urn:schemas-microsoft-com:office:office" xmlns:r="http://schemas.openxmlformats.org/officeDocument/2006/relationships" xmlns:m="http://schemas.openxmlformats.org/officeDocument/2006/math" xmlns:v="urn:schemas-microsoft-com:vml" xmlns:wp14="http://schemas.microsoft.com/office/word/2010/wordprocessingDrawing" xmlns:wp="http://schemas.openxmlformats.org/drawingml/2006/wordprocessingDrawing" xmlns:w10="urn:schemas-microsoft-com:office:word" xmlns:w="http://schemas.openxmlformats.org/wordprocessingml/2006/main" xmlns:w14="http://schemas.microsoft.com/office/word/2010/wordml" xmlns:w15="http://schemas.microsoft.com/office/word/2012/wordml" xmlns:w16cex="http://schemas.microsoft.com/office/word/2018/wordml/cex" xmlns:w16cid="http://schemas.microsoft.com/office/word/2016/wordml/cid" xmlns:w16="http://schemas.microsoft.com/office/word/2018/wordml" xmlns:w16sdtdh="http://schemas.microsoft.com/office/word/2020/wordml/sdtdatahash" xmlns:w16se="http://schemas.microsoft.com/office/word/2015/wordml/symex" xmlns:wpg="http://schemas.microsoft.com/office/word/2010/wordprocessingGroup" xmlns:wpi="http://schemas.microsoft.com/office/word/2010/wordprocessingInk" xmlns:wne="http://schemas.microsoft.com/office/word/2006/wordml" xmlns:wps="http://schemas.microsoft.com/office/word/2010/wordprocessingShape" mc:Ignorable="w14 w15 w16se w16cid w16 w16cex w16sdtdh wp14">
   <w:endnote w:type="separator" w:id="-1">
     <w:p>
       <w:r>
@@ -29847,7 +29847,7 @@
 </file>
 
 <file path=word/footer1.xml><?xml version="1.0" encoding="utf-8"?>
-<w:ftr xmlns:wpc="http://schemas.microsoft.com/office/word/2010/wordprocessingCanvas" xmlns:cx="http://schemas.microsoft.com/office/drawing/2014/chartex" xmlns:cx1="http://schemas.microsoft.com/office/drawing/2015/9/8/chartex" xmlns:cx2="http://schemas.microsoft.com/office/drawing/2015/10/21/chartex" xmlns:cx3="http://schemas.microsoft.com/office/drawing/2016/5/9/chartex" xmlns:cx4="http://schemas.microsoft.com/office/drawing/2016/5/10/chartex" xmlns:cx5="http://schemas.microsoft.com/office/drawing/2016/5/11/chartex" xmlns:cx6="http://schemas.microsoft.com/office/drawing/2016/5/12/chartex" xmlns:cx7="http://schemas.microsoft.com/office/drawing/2016/5/13/chartex" xmlns:cx8="http://schemas.microsoft.com/office/drawing/2016/5/14/chartex" xmlns:mc="http://schemas.openxmlformats.org/markup-compatibility/2006" xmlns:aink="http://schemas.microsoft.com/office/drawing/2016/ink" xmlns:am3d="http://schemas.microsoft.com/office/drawing/2017/model3d" xmlns:o="urn:schemas-microsoft-com:office:office" xmlns:oel="http://schemas.microsoft.com/office/2019/extlst" xmlns:r="http://schemas.openxmlformats.org/officeDocument/2006/relationships" xmlns:m="http://schemas.openxmlformats.org/officeDocument/2006/math" xmlns:v="urn:schemas-microsoft-com:vml" xmlns:wp14="http://schemas.microsoft.com/office/word/2010/wordprocessingDrawing" xmlns:wp="http://schemas.openxmlformats.org/drawingml/2006/wordprocessingDrawing" xmlns:w10="urn:schemas-microsoft-com:office:word" xmlns:w="http://schemas.openxmlformats.org/wordprocessingml/2006/main" xmlns:w14="http://schemas.microsoft.com/office/word/2010/wordml" xmlns:w15="http://schemas.microsoft.com/office/word/2012/wordml" xmlns:w16cex="http://schemas.microsoft.com/office/word/2018/wordml/cex" xmlns:w16cid="http://schemas.microsoft.com/office/word/2016/wordml/cid" xmlns:w16="http://schemas.microsoft.com/office/word/2018/wordml" xmlns:w16du="http://schemas.microsoft.com/office/word/2023/wordml/word16du" xmlns:w16sdtdh="http://schemas.microsoft.com/office/word/2020/wordml/sdtdatahash" xmlns:w16se="http://schemas.microsoft.com/office/word/2015/wordml/symex" xmlns:wpg="http://schemas.microsoft.com/office/word/2010/wordprocessingGroup" xmlns:wpi="http://schemas.microsoft.com/office/word/2010/wordprocessingInk" xmlns:wne="http://schemas.microsoft.com/office/word/2006/wordml" xmlns:wps="http://schemas.microsoft.com/office/word/2010/wordprocessingShape" mc:Ignorable="w14 w15 w16se w16cid w16 w16cex w16sdtdh w16du wp14">
+<w:ftr xmlns:wpc="http://schemas.microsoft.com/office/word/2010/wordprocessingCanvas" xmlns:cx="http://schemas.microsoft.com/office/drawing/2014/chartex" xmlns:cx1="http://schemas.microsoft.com/office/drawing/2015/9/8/chartex" xmlns:cx2="http://schemas.microsoft.com/office/drawing/2015/10/21/chartex" xmlns:cx3="http://schemas.microsoft.com/office/drawing/2016/5/9/chartex" xmlns:cx4="http://schemas.microsoft.com/office/drawing/2016/5/10/chartex" xmlns:cx5="http://schemas.microsoft.com/office/drawing/2016/5/11/chartex" xmlns:cx6="http://schemas.microsoft.com/office/drawing/2016/5/12/chartex" xmlns:cx7="http://schemas.microsoft.com/office/drawing/2016/5/13/chartex" xmlns:cx8="http://schemas.microsoft.com/office/drawing/2016/5/14/chartex" xmlns:mc="http://schemas.openxmlformats.org/markup-compatibility/2006" xmlns:aink="http://schemas.microsoft.com/office/drawing/2016/ink" xmlns:am3d="http://schemas.microsoft.com/office/drawing/2017/model3d" xmlns:o="urn:schemas-microsoft-com:office:office" xmlns:r="http://schemas.openxmlformats.org/officeDocument/2006/relationships" xmlns:m="http://schemas.openxmlformats.org/officeDocument/2006/math" xmlns:v="urn:schemas-microsoft-com:vml" xmlns:wp14="http://schemas.microsoft.com/office/word/2010/wordprocessingDrawing" xmlns:wp="http://schemas.openxmlformats.org/drawingml/2006/wordprocessingDrawing" xmlns:w10="urn:schemas-microsoft-com:office:word" xmlns:w="http://schemas.openxmlformats.org/wordprocessingml/2006/main" xmlns:w14="http://schemas.microsoft.com/office/word/2010/wordml" xmlns:w15="http://schemas.microsoft.com/office/word/2012/wordml" xmlns:w16cex="http://schemas.microsoft.com/office/word/2018/wordml/cex" xmlns:w16cid="http://schemas.microsoft.com/office/word/2016/wordml/cid" xmlns:w16="http://schemas.microsoft.com/office/word/2018/wordml" xmlns:w16sdtdh="http://schemas.microsoft.com/office/word/2020/wordml/sdtdatahash" xmlns:w16se="http://schemas.microsoft.com/office/word/2015/wordml/symex" xmlns:wpg="http://schemas.microsoft.com/office/word/2010/wordprocessingGroup" xmlns:wpi="http://schemas.microsoft.com/office/word/2010/wordprocessingInk" xmlns:wne="http://schemas.microsoft.com/office/word/2006/wordml" xmlns:wps="http://schemas.microsoft.com/office/word/2010/wordprocessingShape" mc:Ignorable="w14 w15 w16se w16cid w16 w16cex w16sdtdh wp14">
   <w:tbl>
     <w:tblPr>
       <w:tblW w:w="9866" w:type="dxa"/>
@@ -30336,7 +30336,7 @@
 </file>
 
 <file path=word/footnotes.xml><?xml version="1.0" encoding="utf-8"?>
-<w:footnotes xmlns:wpc="http://schemas.microsoft.com/office/word/2010/wordprocessingCanvas" xmlns:cx="http://schemas.microsoft.com/office/drawing/2014/chartex" xmlns:cx1="http://schemas.microsoft.com/office/drawing/2015/9/8/chartex" xmlns:cx2="http://schemas.microsoft.com/office/drawing/2015/10/21/chartex" xmlns:cx3="http://schemas.microsoft.com/office/drawing/2016/5/9/chartex" xmlns:cx4="http://schemas.microsoft.com/office/drawing/2016/5/10/chartex" xmlns:cx5="http://schemas.microsoft.com/office/drawing/2016/5/11/chartex" xmlns:cx6="http://schemas.microsoft.com/office/drawing/2016/5/12/chartex" xmlns:cx7="http://schemas.microsoft.com/office/drawing/2016/5/13/chartex" xmlns:cx8="http://schemas.microsoft.com/office/drawing/2016/5/14/chartex" xmlns:mc="http://schemas.openxmlformats.org/markup-compatibility/2006" xmlns:aink="http://schemas.microsoft.com/office/drawing/2016/ink" xmlns:am3d="http://schemas.microsoft.com/office/drawing/2017/model3d" xmlns:o="urn:schemas-microsoft-com:office:office" xmlns:oel="http://schemas.microsoft.com/office/2019/extlst" xmlns:r="http://schemas.openxmlformats.org/officeDocument/2006/relationships" xmlns:m="http://schemas.openxmlformats.org/officeDocument/2006/math" xmlns:v="urn:schemas-microsoft-com:vml" xmlns:wp14="http://schemas.microsoft.com/office/word/2010/wordprocessingDrawing" xmlns:wp="http://schemas.openxmlformats.org/drawingml/2006/wordprocessingDrawing" xmlns:w10="urn:schemas-microsoft-com:office:word" xmlns:w="http://schemas.openxmlformats.org/wordprocessingml/2006/main" xmlns:w14="http://schemas.microsoft.com/office/word/2010/wordml" xmlns:w15="http://schemas.microsoft.com/office/word/2012/wordml" xmlns:w16cex="http://schemas.microsoft.com/office/word/2018/wordml/cex" xmlns:w16cid="http://schemas.microsoft.com/office/word/2016/wordml/cid" xmlns:w16="http://schemas.microsoft.com/office/word/2018/wordml" xmlns:w16du="http://schemas.microsoft.com/office/word/2023/wordml/word16du" xmlns:w16sdtdh="http://schemas.microsoft.com/office/word/2020/wordml/sdtdatahash" xmlns:w16se="http://schemas.microsoft.com/office/word/2015/wordml/symex" xmlns:wpg="http://schemas.microsoft.com/office/word/2010/wordprocessingGroup" xmlns:wpi="http://schemas.microsoft.com/office/word/2010/wordprocessingInk" xmlns:wne="http://schemas.microsoft.com/office/word/2006/wordml" xmlns:wps="http://schemas.microsoft.com/office/word/2010/wordprocessingShape" mc:Ignorable="w14 w15 w16se w16cid w16 w16cex w16sdtdh w16du wp14">
+<w:footnotes xmlns:wpc="http://schemas.microsoft.com/office/word/2010/wordprocessingCanvas" xmlns:cx="http://schemas.microsoft.com/office/drawing/2014/chartex" xmlns:cx1="http://schemas.microsoft.com/office/drawing/2015/9/8/chartex" xmlns:cx2="http://schemas.microsoft.com/office/drawing/2015/10/21/chartex" xmlns:cx3="http://schemas.microsoft.com/office/drawing/2016/5/9/chartex" xmlns:cx4="http://schemas.microsoft.com/office/drawing/2016/5/10/chartex" xmlns:cx5="http://schemas.microsoft.com/office/drawing/2016/5/11/chartex" xmlns:cx6="http://schemas.microsoft.com/office/drawing/2016/5/12/chartex" xmlns:cx7="http://schemas.microsoft.com/office/drawing/2016/5/13/chartex" xmlns:cx8="http://schemas.microsoft.com/office/drawing/2016/5/14/chartex" xmlns:mc="http://schemas.openxmlformats.org/markup-compatibility/2006" xmlns:aink="http://schemas.microsoft.com/office/drawing/2016/ink" xmlns:am3d="http://schemas.microsoft.com/office/drawing/2017/model3d" xmlns:o="urn:schemas-microsoft-com:office:office" xmlns:r="http://schemas.openxmlformats.org/officeDocument/2006/relationships" xmlns:m="http://schemas.openxmlformats.org/officeDocument/2006/math" xmlns:v="urn:schemas-microsoft-com:vml" xmlns:wp14="http://schemas.microsoft.com/office/word/2010/wordprocessingDrawing" xmlns:wp="http://schemas.openxmlformats.org/drawingml/2006/wordprocessingDrawing" xmlns:w10="urn:schemas-microsoft-com:office:word" xmlns:w="http://schemas.openxmlformats.org/wordprocessingml/2006/main" xmlns:w14="http://schemas.microsoft.com/office/word/2010/wordml" xmlns:w15="http://schemas.microsoft.com/office/word/2012/wordml" xmlns:w16cex="http://schemas.microsoft.com/office/word/2018/wordml/cex" xmlns:w16cid="http://schemas.microsoft.com/office/word/2016/wordml/cid" xmlns:w16="http://schemas.microsoft.com/office/word/2018/wordml" xmlns:w16sdtdh="http://schemas.microsoft.com/office/word/2020/wordml/sdtdatahash" xmlns:w16se="http://schemas.microsoft.com/office/word/2015/wordml/symex" xmlns:wpg="http://schemas.microsoft.com/office/word/2010/wordprocessingGroup" xmlns:wpi="http://schemas.microsoft.com/office/word/2010/wordprocessingInk" xmlns:wne="http://schemas.microsoft.com/office/word/2006/wordml" xmlns:wps="http://schemas.microsoft.com/office/word/2010/wordprocessingShape" mc:Ignorable="w14 w15 w16se w16cid w16 w16cex w16sdtdh wp14">
   <w:footnote w:type="separator" w:id="-1">
     <w:p>
       <w:r>
@@ -30358,7 +30358,7 @@
 </file>
 
 <file path=word/header1.xml><?xml version="1.0" encoding="utf-8"?>
-<w:hdr xmlns:wpc="http://schemas.microsoft.com/office/word/2010/wordprocessingCanvas" xmlns:cx="http://schemas.microsoft.com/office/drawing/2014/chartex" xmlns:cx1="http://schemas.microsoft.com/office/drawing/2015/9/8/chartex" xmlns:cx2="http://schemas.microsoft.com/office/drawing/2015/10/21/chartex" xmlns:cx3="http://schemas.microsoft.com/office/drawing/2016/5/9/chartex" xmlns:cx4="http://schemas.microsoft.com/office/drawing/2016/5/10/chartex" xmlns:cx5="http://schemas.microsoft.com/office/drawing/2016/5/11/chartex" xmlns:cx6="http://schemas.microsoft.com/office/drawing/2016/5/12/chartex" xmlns:cx7="http://schemas.microsoft.com/office/drawing/2016/5/13/chartex" xmlns:cx8="http://schemas.microsoft.com/office/drawing/2016/5/14/chartex" xmlns:mc="http://schemas.openxmlformats.org/markup-compatibility/2006" xmlns:aink="http://schemas.microsoft.com/office/drawing/2016/ink" xmlns:am3d="http://schemas.microsoft.com/office/drawing/2017/model3d" xmlns:o="urn:schemas-microsoft-com:office:office" xmlns:oel="http://schemas.microsoft.com/office/2019/extlst" xmlns:r="http://schemas.openxmlformats.org/officeDocument/2006/relationships" xmlns:m="http://schemas.openxmlformats.org/officeDocument/2006/math" xmlns:v="urn:schemas-microsoft-com:vml" xmlns:wp14="http://schemas.microsoft.com/office/word/2010/wordprocessingDrawing" xmlns:wp="http://schemas.openxmlformats.org/drawingml/2006/wordprocessingDrawing" xmlns:w10="urn:schemas-microsoft-com:office:word" xmlns:w="http://schemas.openxmlformats.org/wordprocessingml/2006/main" xmlns:w14="http://schemas.microsoft.com/office/word/2010/wordml" xmlns:w15="http://schemas.microsoft.com/office/word/2012/wordml" xmlns:w16cex="http://schemas.microsoft.com/office/word/2018/wordml/cex" xmlns:w16cid="http://schemas.microsoft.com/office/word/2016/wordml/cid" xmlns:w16="http://schemas.microsoft.com/office/word/2018/wordml" xmlns:w16du="http://schemas.microsoft.com/office/word/2023/wordml/word16du" xmlns:w16sdtdh="http://schemas.microsoft.com/office/word/2020/wordml/sdtdatahash" xmlns:w16se="http://schemas.microsoft.com/office/word/2015/wordml/symex" xmlns:wpg="http://schemas.microsoft.com/office/word/2010/wordprocessingGroup" xmlns:wpi="http://schemas.microsoft.com/office/word/2010/wordprocessingInk" xmlns:wne="http://schemas.microsoft.com/office/word/2006/wordml" xmlns:wps="http://schemas.microsoft.com/office/word/2010/wordprocessingShape" mc:Ignorable="w14 w15 w16se w16cid w16 w16cex w16sdtdh w16du wp14">
+<w:hdr xmlns:wpc="http://schemas.microsoft.com/office/word/2010/wordprocessingCanvas" xmlns:cx="http://schemas.microsoft.com/office/drawing/2014/chartex" xmlns:cx1="http://schemas.microsoft.com/office/drawing/2015/9/8/chartex" xmlns:cx2="http://schemas.microsoft.com/office/drawing/2015/10/21/chartex" xmlns:cx3="http://schemas.microsoft.com/office/drawing/2016/5/9/chartex" xmlns:cx4="http://schemas.microsoft.com/office/drawing/2016/5/10/chartex" xmlns:cx5="http://schemas.microsoft.com/office/drawing/2016/5/11/chartex" xmlns:cx6="http://schemas.microsoft.com/office/drawing/2016/5/12/chartex" xmlns:cx7="http://schemas.microsoft.com/office/drawing/2016/5/13/chartex" xmlns:cx8="http://schemas.microsoft.com/office/drawing/2016/5/14/chartex" xmlns:mc="http://schemas.openxmlformats.org/markup-compatibility/2006" xmlns:aink="http://schemas.microsoft.com/office/drawing/2016/ink" xmlns:am3d="http://schemas.microsoft.com/office/drawing/2017/model3d" xmlns:o="urn:schemas-microsoft-com:office:office" xmlns:r="http://schemas.openxmlformats.org/officeDocument/2006/relationships" xmlns:m="http://schemas.openxmlformats.org/officeDocument/2006/math" xmlns:v="urn:schemas-microsoft-com:vml" xmlns:wp14="http://schemas.microsoft.com/office/word/2010/wordprocessingDrawing" xmlns:wp="http://schemas.openxmlformats.org/drawingml/2006/wordprocessingDrawing" xmlns:w10="urn:schemas-microsoft-com:office:word" xmlns:w="http://schemas.openxmlformats.org/wordprocessingml/2006/main" xmlns:w14="http://schemas.microsoft.com/office/word/2010/wordml" xmlns:w15="http://schemas.microsoft.com/office/word/2012/wordml" xmlns:w16cex="http://schemas.microsoft.com/office/word/2018/wordml/cex" xmlns:w16cid="http://schemas.microsoft.com/office/word/2016/wordml/cid" xmlns:w16="http://schemas.microsoft.com/office/word/2018/wordml" xmlns:w16sdtdh="http://schemas.microsoft.com/office/word/2020/wordml/sdtdatahash" xmlns:w16se="http://schemas.microsoft.com/office/word/2015/wordml/symex" xmlns:wpg="http://schemas.microsoft.com/office/word/2010/wordprocessingGroup" xmlns:wpi="http://schemas.microsoft.com/office/word/2010/wordprocessingInk" xmlns:wne="http://schemas.microsoft.com/office/word/2006/wordml" xmlns:wps="http://schemas.microsoft.com/office/word/2010/wordprocessingShape" mc:Ignorable="w14 w15 w16se w16cid w16 w16cex w16sdtdh wp14">
   <w:tbl>
     <w:tblPr>
       <w:tblW w:w="9818" w:type="dxa"/>
@@ -30529,7 +30529,7 @@
 </file>
 
 <file path=word/numbering.xml><?xml version="1.0" encoding="utf-8"?>
-<w:numbering xmlns:wpc="http://schemas.microsoft.com/office/word/2010/wordprocessingCanvas" xmlns:cx="http://schemas.microsoft.com/office/drawing/2014/chartex" xmlns:cx1="http://schemas.microsoft.com/office/drawing/2015/9/8/chartex" xmlns:cx2="http://schemas.microsoft.com/office/drawing/2015/10/21/chartex" xmlns:cx3="http://schemas.microsoft.com/office/drawing/2016/5/9/chartex" xmlns:cx4="http://schemas.microsoft.com/office/drawing/2016/5/10/chartex" xmlns:cx5="http://schemas.microsoft.com/office/drawing/2016/5/11/chartex" xmlns:cx6="http://schemas.microsoft.com/office/drawing/2016/5/12/chartex" xmlns:cx7="http://schemas.microsoft.com/office/drawing/2016/5/13/chartex" xmlns:cx8="http://schemas.microsoft.com/office/drawing/2016/5/14/chartex" xmlns:mc="http://schemas.openxmlformats.org/markup-compatibility/2006" xmlns:aink="http://schemas.microsoft.com/office/drawing/2016/ink" xmlns:am3d="http://schemas.microsoft.com/office/drawing/2017/model3d" xmlns:o="urn:schemas-microsoft-com:office:office" xmlns:oel="http://schemas.microsoft.com/office/2019/extlst" xmlns:r="http://schemas.openxmlformats.org/officeDocument/2006/relationships" xmlns:m="http://schemas.openxmlformats.org/officeDocument/2006/math" xmlns:v="urn:schemas-microsoft-com:vml" xmlns:wp14="http://schemas.microsoft.com/office/word/2010/wordprocessingDrawing" xmlns:wp="http://schemas.openxmlformats.org/drawingml/2006/wordprocessingDrawing" xmlns:w10="urn:schemas-microsoft-com:office:word" xmlns:w="http://schemas.openxmlformats.org/wordprocessingml/2006/main" xmlns:w14="http://schemas.microsoft.com/office/word/2010/wordml" xmlns:w15="http://schemas.microsoft.com/office/word/2012/wordml" xmlns:w16cex="http://schemas.microsoft.com/office/word/2018/wordml/cex" xmlns:w16cid="http://schemas.microsoft.com/office/word/2016/wordml/cid" xmlns:w16="http://schemas.microsoft.com/office/word/2018/wordml" xmlns:w16du="http://schemas.microsoft.com/office/word/2023/wordml/word16du" xmlns:w16sdtdh="http://schemas.microsoft.com/office/word/2020/wordml/sdtdatahash" xmlns:w16se="http://schemas.microsoft.com/office/word/2015/wordml/symex" xmlns:wpg="http://schemas.microsoft.com/office/word/2010/wordprocessingGroup" xmlns:wpi="http://schemas.microsoft.com/office/word/2010/wordprocessingInk" xmlns:wne="http://schemas.microsoft.com/office/word/2006/wordml" xmlns:wps="http://schemas.microsoft.com/office/word/2010/wordprocessingShape" mc:Ignorable="w14 w15 w16se w16cid w16 w16cex w16sdtdh w16du wp14">
+<w:numbering xmlns:wpc="http://schemas.microsoft.com/office/word/2010/wordprocessingCanvas" xmlns:cx="http://schemas.microsoft.com/office/drawing/2014/chartex" xmlns:cx1="http://schemas.microsoft.com/office/drawing/2015/9/8/chartex" xmlns:cx2="http://schemas.microsoft.com/office/drawing/2015/10/21/chartex" xmlns:cx3="http://schemas.microsoft.com/office/drawing/2016/5/9/chartex" xmlns:cx4="http://schemas.microsoft.com/office/drawing/2016/5/10/chartex" xmlns:cx5="http://schemas.microsoft.com/office/drawing/2016/5/11/chartex" xmlns:cx6="http://schemas.microsoft.com/office/drawing/2016/5/12/chartex" xmlns:cx7="http://schemas.microsoft.com/office/drawing/2016/5/13/chartex" xmlns:cx8="http://schemas.microsoft.com/office/drawing/2016/5/14/chartex" xmlns:mc="http://schemas.openxmlformats.org/markup-compatibility/2006" xmlns:aink="http://schemas.microsoft.com/office/drawing/2016/ink" xmlns:am3d="http://schemas.microsoft.com/office/drawing/2017/model3d" xmlns:o="urn:schemas-microsoft-com:office:office" xmlns:r="http://schemas.openxmlformats.org/officeDocument/2006/relationships" xmlns:m="http://schemas.openxmlformats.org/officeDocument/2006/math" xmlns:v="urn:schemas-microsoft-com:vml" xmlns:wp14="http://schemas.microsoft.com/office/word/2010/wordprocessingDrawing" xmlns:wp="http://schemas.openxmlformats.org/drawingml/2006/wordprocessingDrawing" xmlns:w10="urn:schemas-microsoft-com:office:word" xmlns:w="http://schemas.openxmlformats.org/wordprocessingml/2006/main" xmlns:w14="http://schemas.microsoft.com/office/word/2010/wordml" xmlns:w15="http://schemas.microsoft.com/office/word/2012/wordml" xmlns:w16cex="http://schemas.microsoft.com/office/word/2018/wordml/cex" xmlns:w16cid="http://schemas.microsoft.com/office/word/2016/wordml/cid" xmlns:w16="http://schemas.microsoft.com/office/word/2018/wordml" xmlns:w16sdtdh="http://schemas.microsoft.com/office/word/2020/wordml/sdtdatahash" xmlns:w16se="http://schemas.microsoft.com/office/word/2015/wordml/symex" xmlns:wpg="http://schemas.microsoft.com/office/word/2010/wordprocessingGroup" xmlns:wpi="http://schemas.microsoft.com/office/word/2010/wordprocessingInk" xmlns:wne="http://schemas.microsoft.com/office/word/2006/wordml" xmlns:wps="http://schemas.microsoft.com/office/word/2010/wordprocessingShape" mc:Ignorable="w14 w15 w16se w16cid w16 w16cex w16sdtdh wp14">
   <w:abstractNum w:abstractNumId="0" w15:restartNumberingAfterBreak="0">
     <w:nsid w:val="38F12315"/>
     <w:multiLevelType w:val="hybridMultilevel"/>
@@ -31157,29 +31157,29 @@
       </w:pPr>
     </w:lvl>
   </w:abstractNum>
-  <w:num w:numId="1" w16cid:durableId="1301612530">
+  <w:num w:numId="1">
     <w:abstractNumId w:val="2"/>
   </w:num>
-  <w:num w:numId="2" w16cid:durableId="684291109">
+  <w:num w:numId="2">
     <w:abstractNumId w:val="4"/>
   </w:num>
-  <w:num w:numId="3" w16cid:durableId="1164707123">
+  <w:num w:numId="3">
     <w:abstractNumId w:val="1"/>
   </w:num>
-  <w:num w:numId="4" w16cid:durableId="1338925938">
+  <w:num w:numId="4">
     <w:abstractNumId w:val="3"/>
   </w:num>
-  <w:num w:numId="5" w16cid:durableId="150679965">
+  <w:num w:numId="5">
     <w:abstractNumId w:val="0"/>
   </w:num>
-  <w:num w:numId="6" w16cid:durableId="1996252024">
+  <w:num w:numId="6">
     <w:abstractNumId w:val="5"/>
   </w:num>
 </w:numbering>
 </file>
 
 <file path=word/styles.xml><?xml version="1.0" encoding="utf-8"?>
-<w:styles xmlns:mc="http://schemas.openxmlformats.org/markup-compatibility/2006" xmlns:r="http://schemas.openxmlformats.org/officeDocument/2006/relationships" xmlns:w="http://schemas.openxmlformats.org/wordprocessingml/2006/main" xmlns:w14="http://schemas.microsoft.com/office/word/2010/wordml" xmlns:w15="http://schemas.microsoft.com/office/word/2012/wordml" xmlns:w16cex="http://schemas.microsoft.com/office/word/2018/wordml/cex" xmlns:w16cid="http://schemas.microsoft.com/office/word/2016/wordml/cid" xmlns:w16="http://schemas.microsoft.com/office/word/2018/wordml" xmlns:w16du="http://schemas.microsoft.com/office/word/2023/wordml/word16du" xmlns:w16sdtdh="http://schemas.microsoft.com/office/word/2020/wordml/sdtdatahash" xmlns:w16se="http://schemas.microsoft.com/office/word/2015/wordml/symex" mc:Ignorable="w14 w15 w16se w16cid w16 w16cex w16sdtdh w16du">
+<w:styles xmlns:mc="http://schemas.openxmlformats.org/markup-compatibility/2006" xmlns:r="http://schemas.openxmlformats.org/officeDocument/2006/relationships" xmlns:w="http://schemas.openxmlformats.org/wordprocessingml/2006/main" xmlns:w14="http://schemas.microsoft.com/office/word/2010/wordml" xmlns:w15="http://schemas.microsoft.com/office/word/2012/wordml" xmlns:w16cex="http://schemas.microsoft.com/office/word/2018/wordml/cex" xmlns:w16cid="http://schemas.microsoft.com/office/word/2016/wordml/cid" xmlns:w16="http://schemas.microsoft.com/office/word/2018/wordml" xmlns:w16sdtdh="http://schemas.microsoft.com/office/word/2020/wordml/sdtdatahash" xmlns:w16se="http://schemas.microsoft.com/office/word/2015/wordml/symex" mc:Ignorable="w14 w15 w16se w16cid w16 w16cex w16sdtdh">
   <w:docDefaults>
     <w:rPrDefault>
       <w:rPr>

</xml_diff>